<commit_message>
docs: restore Chinese chapter punctuation in lesson six report
</commit_message>
<xml_diff>
--- a/output/docx/campusclaw-lesson-6-report.docx
+++ b/output/docx/campusclaw-lesson-6-report.docx
@@ -94,7 +94,7 @@
         <w:pageBreakBefore/>
       </w:pPr>
       <w:r>
-        <w:t>一 提示词模板与技能上传</w:t>
+        <w:t>一、提示词模板与技能上传</w:t>
       </w:r>
     </w:p>
     <w:p>
@@ -209,7 +209,7 @@
         <w:pageBreakBefore/>
       </w:pPr>
       <w:r>
-        <w:t>二 知识库问答与内容溯源</w:t>
+        <w:t>二、知识库问答与内容溯源</w:t>
       </w:r>
     </w:p>
     <w:p>
@@ -332,7 +332,7 @@
         <w:pageBreakBefore/>
       </w:pPr>
       <w:r>
-        <w:t>三 具体 Skill 的执行过程</w:t>
+        <w:t>三、具体 Skill 的执行过程</w:t>
       </w:r>
     </w:p>
     <w:p>
@@ -455,7 +455,7 @@
         <w:pageBreakBefore/>
       </w:pPr>
       <w:r>
-        <w:t>四 MCP 工具调用与响应</w:t>
+        <w:t>四、MCP 工具调用与响应</w:t>
       </w:r>
     </w:p>
     <w:p>
@@ -578,7 +578,7 @@
         <w:pageBreakBefore/>
       </w:pPr>
       <w:r>
-        <w:t>五 发送给模型的工具定义</w:t>
+        <w:t>五、发送给模型的工具定义</w:t>
       </w:r>
     </w:p>
     <w:p>
@@ -701,7 +701,7 @@
         <w:pageBreakBefore/>
       </w:pPr>
       <w:r>
-        <w:t>六 工具结果如何形成最终回答</w:t>
+        <w:t>六、工具结果如何形成最终回答</w:t>
       </w:r>
     </w:p>
     <w:p>
@@ -824,7 +824,7 @@
         <w:pageBreakBefore/>
       </w:pPr>
       <w:r>
-        <w:t>七 Token 认证与权限检查</w:t>
+        <w:t>七、Token 认证与权限检查</w:t>
       </w:r>
     </w:p>
     <w:p>
@@ -906,7 +906,7 @@
         <w:pageBreakBefore/>
       </w:pPr>
       <w:r>
-        <w:t>八 五个验证问题的回答</w:t>
+        <w:t>八、五个验证问题的回答</w:t>
       </w:r>
     </w:p>
     <w:p>

</xml_diff>